<commit_message>
docs: add portable HTML workshop materials
Co-authored-by: Copilot <223556219+Copilot@users.noreply.github.com>
</commit_message>
<xml_diff>
--- a/docs/rapp-workshop/downloads/FY27 RAPP Facilitator Guide.docx
+++ b/docs/rapp-workshop/downloads/FY27 RAPP Facilitator Guide.docx
@@ -1161,7 +1161,7 @@
           <w:sz w:val="21"/>
           <w:szCs w:val="21"/>
         </w:rPr>
-        <w:t xml:space="preserve">Replace these tokens before sending customer-facing material: {CUSTOMER}, {DATE}, {TIME_ZONE}, {WORKSHOP_URL}, {TARGET_ENVIRONMENT}, {FACILITATOR_NAME}, {SUPPORT_CONTACT}, and {ARTIFACT_LOCATION}.</w:t>
+        <w:t xml:space="preserve">Replace these tokens before sending customer-facing material: {CUSTOMER}, {DATE}, {TIME_ZONE}, {WORKSHOP_URL}, {TARGET_ENVIRONMENT}, {FACILITATOR_NAME}, {SUPPORT_CONTACT}, and {ARTIFACT_LOCATION}. The communications pack adds per-template tokens (for example {SCENARIO_TITLE}, {SURVEY_DUE_DATE}, {FEEDBACK_LINK}); replace every {TOKEN} placeholder before sending.</w:t>
       </w:r>
     </w:p>
     <w:tbl>
@@ -1637,7 +1637,7 @@
                 <w:sz w:val="21"/>
                 <w:szCs w:val="21"/>
               </w:rPr>
-              <w:t xml:space="preserve">22-slide deck with speaker notes and a five-step build-along</w:t>
+              <w:t xml:space="preserve">22-slide build-along paired with the facilitator guide talk track</w:t>
             </w:r>
           </w:p>
         </w:tc>

</xml_diff>